<commit_message>
edit to crd rsk mdl pdf
</commit_message>
<xml_diff>
--- a/Python_PD_LGD_EAD_Modeling/1_modified/Credit_Risk_Model_Components.docx
+++ b/Python_PD_LGD_EAD_Modeling/1_modified/Credit_Risk_Model_Components.docx
@@ -171,7 +171,21 @@
           <w:rFonts w:ascii="Bahnschrift Light" w:hAnsi="Bahnschrift Light"/>
           <w:sz w:val="24"/>
         </w:rPr>
-        <w:t>Estimates the likelihood that a borrower will default w/in a given timeframe (e.g. 12 months).</w:t>
+        <w:t>Estimates the likelihood that a borrower will default w</w:t>
+      </w:r>
+      <w:r>
+        <w:rPr>
+          <w:rFonts w:ascii="Bahnschrift Light" w:hAnsi="Bahnschrift Light"/>
+          <w:sz w:val="24"/>
+        </w:rPr>
+        <w:t>ith</w:t>
+      </w:r>
+      <w:r>
+        <w:rPr>
+          <w:rFonts w:ascii="Bahnschrift Light" w:hAnsi="Bahnschrift Light"/>
+          <w:sz w:val="24"/>
+        </w:rPr>
+        <w:t>in a given timeframe (e.g. 12 months).</w:t>
       </w:r>
     </w:p>
     <w:p>
@@ -388,7 +402,25 @@
           <w:sz w:val="32"/>
           <w:szCs w:val="32"/>
         </w:rPr>
-        <w:t xml:space="preserve"> Borrower did no default</w:t>
+        <w:t xml:space="preserve"> Borrower did no</w:t>
+      </w:r>
+      <w:r>
+        <w:rPr>
+          <w:rFonts w:ascii="Bahnschrift Light" w:hAnsi="Bahnschrift Light"/>
+          <w:sz w:val="32"/>
+          <w:szCs w:val="32"/>
+        </w:rPr>
+        <w:t>t</w:t>
+      </w:r>
+      <w:bookmarkStart w:id="0" w:name="_GoBack"/>
+      <w:bookmarkEnd w:id="0"/>
+      <w:r>
+        <w:rPr>
+          <w:rFonts w:ascii="Bahnschrift Light" w:hAnsi="Bahnschrift Light"/>
+          <w:sz w:val="32"/>
+          <w:szCs w:val="32"/>
+        </w:rPr>
+        <w:t xml:space="preserve"> default</w:t>
       </w:r>
     </w:p>
     <w:p>
@@ -1611,17 +1643,7 @@
           <w:sz w:val="32"/>
           <w:szCs w:val="32"/>
         </w:rPr>
-        <w:t>Independe</w:t>
-      </w:r>
-      <w:bookmarkStart w:id="0" w:name="_GoBack"/>
-      <w:bookmarkEnd w:id="0"/>
-      <w:r>
-        <w:rPr>
-          <w:rFonts w:ascii="Bahnschrift Light" w:hAnsi="Bahnschrift Light"/>
-          <w:sz w:val="32"/>
-          <w:szCs w:val="32"/>
-        </w:rPr>
-        <w:t>nt Variables [</w:t>
+        <w:t>Independent Variables [</w:t>
       </w:r>
       <w:r>
         <w:rPr>

</xml_diff>